<commit_message>
Simulations: ▼ ▲ steppers instead of sliders, hover readout on every graph, top-aligned controls; updated worksheets
</commit_message>
<xml_diff>
--- a/03-friction-incline/worksheet.docx
+++ b/03-friction-incline/worksheet.docx
@@ -149,13 +149,13 @@
                 <w:b/>
                 <w:sz w:val="20"/>
               </w:rPr>
-              <w:t>▶ Release</w:t>
+              <w:t>▶ Release lets the block go at the angle in the box.</w:t>
             </w:r>
             <w:r>
               <w:rPr>
                 <w:sz w:val="20"/>
               </w:rPr>
-              <w:t xml:space="preserve"> lets the block go at the angle on the slider. The </w:t>
+              <w:t xml:space="preserve"> The </w:t>
             </w:r>
             <w:r>
               <w:rPr>

</xml_diff>